<commit_message>
Update Отчёт УП 03.02 25.05.2026.docx
</commit_message>
<xml_diff>
--- a/отчёт уп/Отчёт УП 03.02 25.05.2026.docx
+++ b/отчёт уп/Отчёт УП 03.02 25.05.2026.docx
@@ -423,9 +423,8 @@
           <w:u w:val="single"/>
           <w14:ligatures w14:val="none"/>
         </w:rPr>
-        <w:t xml:space="preserve">Время прохождения практики    с </w:t>
-      </w:r>
-      <w:proofErr w:type="gramStart"/>
+        <w:t>Время прохождения практики    с «</w:t>
+      </w:r>
       <w:r>
         <w:rPr>
           <w:rFonts w:ascii="Times New Roman" w:eastAsia="Times New Roman" w:hAnsi="Times New Roman" w:cs="Times New Roman"/>
@@ -433,7 +432,7 @@
           <w:u w:val="single"/>
           <w14:ligatures w14:val="none"/>
         </w:rPr>
-        <w:t>«</w:t>
+        <w:t xml:space="preserve">  2</w:t>
       </w:r>
       <w:r>
         <w:rPr>
@@ -442,7 +441,7 @@
           <w:u w:val="single"/>
           <w14:ligatures w14:val="none"/>
         </w:rPr>
-        <w:t xml:space="preserve">  2</w:t>
+        <w:t>5</w:t>
       </w:r>
       <w:r>
         <w:rPr>
@@ -451,9 +450,8 @@
           <w:u w:val="single"/>
           <w14:ligatures w14:val="none"/>
         </w:rPr>
-        <w:t>5</w:t>
-      </w:r>
-      <w:proofErr w:type="gramEnd"/>
+        <w:t xml:space="preserve">  </w:t>
+      </w:r>
       <w:r>
         <w:rPr>
           <w:rFonts w:ascii="Times New Roman" w:eastAsia="Times New Roman" w:hAnsi="Times New Roman" w:cs="Times New Roman"/>
@@ -461,7 +459,7 @@
           <w:u w:val="single"/>
           <w14:ligatures w14:val="none"/>
         </w:rPr>
-        <w:t xml:space="preserve">  </w:t>
+        <w:t>»</w:t>
       </w:r>
       <w:r>
         <w:rPr>
@@ -470,7 +468,7 @@
           <w:u w:val="single"/>
           <w14:ligatures w14:val="none"/>
         </w:rPr>
-        <w:t>»</w:t>
+        <w:t xml:space="preserve">      </w:t>
       </w:r>
       <w:r>
         <w:rPr>
@@ -479,7 +477,7 @@
           <w:u w:val="single"/>
           <w14:ligatures w14:val="none"/>
         </w:rPr>
-        <w:t xml:space="preserve">      </w:t>
+        <w:t>мая</w:t>
       </w:r>
       <w:r>
         <w:rPr>
@@ -488,7 +486,7 @@
           <w:u w:val="single"/>
           <w14:ligatures w14:val="none"/>
         </w:rPr>
-        <w:t>мая</w:t>
+        <w:t xml:space="preserve">     20</w:t>
       </w:r>
       <w:r>
         <w:rPr>
@@ -497,7 +495,7 @@
           <w:u w:val="single"/>
           <w14:ligatures w14:val="none"/>
         </w:rPr>
-        <w:t xml:space="preserve">     20</w:t>
+        <w:t xml:space="preserve">26 </w:t>
       </w:r>
       <w:r>
         <w:rPr>
@@ -506,36 +504,7 @@
           <w:u w:val="single"/>
           <w14:ligatures w14:val="none"/>
         </w:rPr>
-        <w:t xml:space="preserve">26 </w:t>
-      </w:r>
-      <w:r>
-        <w:rPr>
-          <w:rFonts w:ascii="Times New Roman" w:eastAsia="Times New Roman" w:hAnsi="Times New Roman" w:cs="Times New Roman"/>
-          <w:kern w:val="0"/>
-          <w:u w:val="single"/>
-          <w14:ligatures w14:val="none"/>
-        </w:rPr>
-        <w:t xml:space="preserve">г.   </w:t>
-      </w:r>
-      <w:proofErr w:type="gramStart"/>
-      <w:r>
-        <w:rPr>
-          <w:rFonts w:ascii="Times New Roman" w:eastAsia="Times New Roman" w:hAnsi="Times New Roman" w:cs="Times New Roman"/>
-          <w:kern w:val="0"/>
-          <w:u w:val="single"/>
-          <w14:ligatures w14:val="none"/>
-        </w:rPr>
-        <w:t>по  «</w:t>
-      </w:r>
-      <w:proofErr w:type="gramEnd"/>
-      <w:r>
-        <w:rPr>
-          <w:rFonts w:ascii="Times New Roman" w:eastAsia="Times New Roman" w:hAnsi="Times New Roman" w:cs="Times New Roman"/>
-          <w:kern w:val="0"/>
-          <w:u w:val="single"/>
-          <w14:ligatures w14:val="none"/>
-        </w:rPr>
-        <w:t xml:space="preserve">  </w:t>
+        <w:t xml:space="preserve">г.   по  «  </w:t>
       </w:r>
       <w:r>
         <w:rPr>
@@ -4429,25 +4398,7 @@
           <w:kern w:val="0"/>
           <w14:ligatures w14:val="none"/>
         </w:rPr>
-        <w:t xml:space="preserve">Руководитель практики от </w:t>
-      </w:r>
-      <w:proofErr w:type="gramStart"/>
-      <w:r>
-        <w:rPr>
-          <w:rFonts w:ascii="Times New Roman" w:eastAsia="Times New Roman" w:hAnsi="Times New Roman" w:cs="Times New Roman"/>
-          <w:kern w:val="0"/>
-          <w14:ligatures w14:val="none"/>
-        </w:rPr>
-        <w:t>колледжа  _</w:t>
-      </w:r>
-      <w:proofErr w:type="gramEnd"/>
-      <w:r>
-        <w:rPr>
-          <w:rFonts w:ascii="Times New Roman" w:eastAsia="Times New Roman" w:hAnsi="Times New Roman" w:cs="Times New Roman"/>
-          <w:kern w:val="0"/>
-          <w14:ligatures w14:val="none"/>
-        </w:rPr>
-        <w:t xml:space="preserve">__________    ____________         </w:t>
+        <w:t xml:space="preserve">Руководитель практики от колледжа  ___________    ____________         </w:t>
       </w:r>
       <w:r>
         <w:rPr>
@@ -4498,33 +4449,15 @@
           <w:kern w:val="0"/>
           <w14:ligatures w14:val="none"/>
         </w:rPr>
-        <w:t>(</w:t>
-      </w:r>
-      <w:proofErr w:type="gramStart"/>
-      <w:r>
-        <w:rPr>
-          <w:rFonts w:ascii="Times New Roman" w:eastAsia="Times New Roman" w:hAnsi="Times New Roman" w:cs="Times New Roman"/>
-          <w:kern w:val="0"/>
-          <w14:ligatures w14:val="none"/>
-        </w:rPr>
-        <w:t>подпись)</w:t>
-      </w:r>
-      <w:r>
-        <w:rPr>
-          <w:rFonts w:ascii="Times New Roman" w:eastAsia="Times New Roman" w:hAnsi="Times New Roman" w:cs="Times New Roman"/>
-          <w:kern w:val="0"/>
-          <w14:ligatures w14:val="none"/>
-        </w:rPr>
-        <w:t xml:space="preserve">   </w:t>
-      </w:r>
-      <w:proofErr w:type="gramEnd"/>
-      <w:r>
-        <w:rPr>
-          <w:rFonts w:ascii="Times New Roman" w:eastAsia="Times New Roman" w:hAnsi="Times New Roman" w:cs="Times New Roman"/>
-          <w:kern w:val="0"/>
-          <w14:ligatures w14:val="none"/>
-        </w:rPr>
-        <w:t xml:space="preserve">           </w:t>
+        <w:t>(подпись)</w:t>
+      </w:r>
+      <w:r>
+        <w:rPr>
+          <w:rFonts w:ascii="Times New Roman" w:eastAsia="Times New Roman" w:hAnsi="Times New Roman" w:cs="Times New Roman"/>
+          <w:kern w:val="0"/>
+          <w14:ligatures w14:val="none"/>
+        </w:rPr>
+        <w:t xml:space="preserve">              </w:t>
       </w:r>
       <w:r>
         <w:rPr>
@@ -5939,7 +5872,6 @@
         </w:rPr>
         <w:t>(</w:t>
       </w:r>
-      <w:proofErr w:type="gramStart"/>
       <w:r>
         <w:rPr>
           <w:rFonts w:ascii="Times New Roman" w:eastAsia="Times New Roman" w:hAnsi="Times New Roman" w:cs="Times New Roman"/>
@@ -5954,16 +5886,7 @@
           <w:kern w:val="0"/>
           <w14:ligatures w14:val="none"/>
         </w:rPr>
-        <w:t xml:space="preserve">   </w:t>
-      </w:r>
-      <w:proofErr w:type="gramEnd"/>
-      <w:r>
-        <w:rPr>
-          <w:rFonts w:ascii="Times New Roman" w:eastAsia="Times New Roman" w:hAnsi="Times New Roman" w:cs="Times New Roman"/>
-          <w:kern w:val="0"/>
-          <w14:ligatures w14:val="none"/>
-        </w:rPr>
-        <w:t xml:space="preserve">                  </w:t>
+        <w:t xml:space="preserve">                     </w:t>
       </w:r>
       <w:r>
         <w:rPr>
@@ -13631,7 +13554,6 @@
         <w:t>(</w:t>
       </w:r>
       <w:proofErr w:type="spellStart"/>
-      <w:proofErr w:type="gramStart"/>
       <w:r>
         <w:rPr>
           <w:rFonts w:ascii="Consolas" w:hAnsi="Consolas" w:cs="Times New Roman"/>
@@ -13641,7 +13563,6 @@
         <w:t>models.Model</w:t>
       </w:r>
       <w:proofErr w:type="spellEnd"/>
-      <w:proofErr w:type="gramEnd"/>
       <w:r>
         <w:rPr>
           <w:rFonts w:ascii="Consolas" w:hAnsi="Consolas" w:cs="Times New Roman"/>
@@ -13669,7 +13590,6 @@
         <w:t xml:space="preserve">    user = </w:t>
       </w:r>
       <w:proofErr w:type="spellStart"/>
-      <w:proofErr w:type="gramStart"/>
       <w:r>
         <w:rPr>
           <w:rFonts w:ascii="Consolas" w:hAnsi="Consolas" w:cs="Times New Roman"/>
@@ -13679,7 +13599,6 @@
         <w:t>models.ForeignKey</w:t>
       </w:r>
       <w:proofErr w:type="spellEnd"/>
-      <w:proofErr w:type="gramEnd"/>
       <w:r>
         <w:rPr>
           <w:rFonts w:ascii="Consolas" w:hAnsi="Consolas" w:cs="Times New Roman"/>
@@ -13707,23 +13626,13 @@
         <w:t xml:space="preserve">        </w:t>
       </w:r>
       <w:proofErr w:type="spellStart"/>
-      <w:proofErr w:type="gramStart"/>
-      <w:r>
-        <w:rPr>
-          <w:rFonts w:ascii="Consolas" w:hAnsi="Consolas" w:cs="Times New Roman"/>
-          <w:sz w:val="22"/>
-          <w:lang w:val="en-US"/>
-        </w:rPr>
-        <w:t>settings.AUTH</w:t>
-      </w:r>
-      <w:proofErr w:type="gramEnd"/>
-      <w:r>
-        <w:rPr>
-          <w:rFonts w:ascii="Consolas" w:hAnsi="Consolas" w:cs="Times New Roman"/>
-          <w:sz w:val="22"/>
-          <w:lang w:val="en-US"/>
-        </w:rPr>
-        <w:t>_USER_MODEL</w:t>
+      <w:r>
+        <w:rPr>
+          <w:rFonts w:ascii="Consolas" w:hAnsi="Consolas" w:cs="Times New Roman"/>
+          <w:sz w:val="22"/>
+          <w:lang w:val="en-US"/>
+        </w:rPr>
+        <w:t>settings.AUTH_USER_MODEL</w:t>
       </w:r>
       <w:proofErr w:type="spellEnd"/>
       <w:r>
@@ -13771,7 +13680,6 @@
         <w:t>=</w:t>
       </w:r>
       <w:proofErr w:type="spellStart"/>
-      <w:proofErr w:type="gramStart"/>
       <w:r>
         <w:rPr>
           <w:rFonts w:ascii="Consolas" w:hAnsi="Consolas" w:cs="Times New Roman"/>
@@ -13781,7 +13689,6 @@
         <w:t>models.CASCADE</w:t>
       </w:r>
       <w:proofErr w:type="spellEnd"/>
-      <w:proofErr w:type="gramEnd"/>
       <w:r>
         <w:rPr>
           <w:rFonts w:ascii="Consolas" w:hAnsi="Consolas" w:cs="Times New Roman"/>
@@ -13932,7 +13839,6 @@
         <w:t xml:space="preserve">    task = </w:t>
       </w:r>
       <w:proofErr w:type="spellStart"/>
-      <w:proofErr w:type="gramStart"/>
       <w:r>
         <w:rPr>
           <w:rFonts w:ascii="Consolas" w:hAnsi="Consolas" w:cs="Times New Roman"/>
@@ -13942,7 +13848,6 @@
         <w:t>models.ForeignKey</w:t>
       </w:r>
       <w:proofErr w:type="spellEnd"/>
-      <w:proofErr w:type="gramEnd"/>
       <w:r>
         <w:rPr>
           <w:rFonts w:ascii="Consolas" w:hAnsi="Consolas" w:cs="Times New Roman"/>
@@ -14024,7 +13929,6 @@
         <w:t>=</w:t>
       </w:r>
       <w:proofErr w:type="spellStart"/>
-      <w:proofErr w:type="gramStart"/>
       <w:r>
         <w:rPr>
           <w:rFonts w:ascii="Consolas" w:hAnsi="Consolas" w:cs="Times New Roman"/>
@@ -14034,7 +13938,6 @@
         <w:t>models.CASCADE</w:t>
       </w:r>
       <w:proofErr w:type="spellEnd"/>
-      <w:proofErr w:type="gramEnd"/>
       <w:r>
         <w:rPr>
           <w:rFonts w:ascii="Consolas" w:hAnsi="Consolas" w:cs="Times New Roman"/>
@@ -14200,7 +14103,6 @@
         <w:t xml:space="preserve"> = </w:t>
       </w:r>
       <w:proofErr w:type="spellStart"/>
-      <w:proofErr w:type="gramStart"/>
       <w:r>
         <w:rPr>
           <w:rFonts w:ascii="Consolas" w:hAnsi="Consolas" w:cs="Times New Roman"/>
@@ -14210,7 +14112,6 @@
         <w:t>models.TextField</w:t>
       </w:r>
       <w:proofErr w:type="spellEnd"/>
-      <w:proofErr w:type="gramEnd"/>
       <w:r>
         <w:rPr>
           <w:rFonts w:ascii="Consolas" w:hAnsi="Consolas" w:cs="Times New Roman"/>
@@ -14286,7 +14187,6 @@
         <w:t xml:space="preserve"> = </w:t>
       </w:r>
       <w:proofErr w:type="spellStart"/>
-      <w:proofErr w:type="gramStart"/>
       <w:r>
         <w:rPr>
           <w:rFonts w:ascii="Consolas" w:hAnsi="Consolas" w:cs="Times New Roman"/>
@@ -14296,7 +14196,6 @@
         <w:t>models.FileField</w:t>
       </w:r>
       <w:proofErr w:type="spellEnd"/>
-      <w:proofErr w:type="gramEnd"/>
       <w:r>
         <w:rPr>
           <w:rFonts w:ascii="Consolas" w:hAnsi="Consolas" w:cs="Times New Roman"/>
@@ -14498,7 +14397,6 @@
         <w:t xml:space="preserve"> = </w:t>
       </w:r>
       <w:proofErr w:type="spellStart"/>
-      <w:proofErr w:type="gramStart"/>
       <w:r>
         <w:rPr>
           <w:rFonts w:ascii="Consolas" w:hAnsi="Consolas" w:cs="Times New Roman"/>
@@ -14508,7 +14406,6 @@
         <w:t>models.TextField</w:t>
       </w:r>
       <w:proofErr w:type="spellEnd"/>
-      <w:proofErr w:type="gramEnd"/>
       <w:r>
         <w:rPr>
           <w:rFonts w:ascii="Consolas" w:hAnsi="Consolas" w:cs="Times New Roman"/>
@@ -14584,7 +14481,6 @@
         <w:t xml:space="preserve"> = </w:t>
       </w:r>
       <w:proofErr w:type="spellStart"/>
-      <w:proofErr w:type="gramStart"/>
       <w:r>
         <w:rPr>
           <w:rFonts w:ascii="Consolas" w:hAnsi="Consolas" w:cs="Times New Roman"/>
@@ -14594,7 +14490,6 @@
         <w:t>models.BooleanField</w:t>
       </w:r>
       <w:proofErr w:type="spellEnd"/>
-      <w:proofErr w:type="gramEnd"/>
       <w:r>
         <w:rPr>
           <w:rFonts w:ascii="Consolas" w:hAnsi="Consolas" w:cs="Times New Roman"/>
@@ -14655,7 +14550,6 @@
         <w:t xml:space="preserve"> = </w:t>
       </w:r>
       <w:proofErr w:type="spellStart"/>
-      <w:proofErr w:type="gramStart"/>
       <w:r>
         <w:rPr>
           <w:rFonts w:ascii="Consolas" w:hAnsi="Consolas" w:cs="Times New Roman"/>
@@ -14665,7 +14559,6 @@
         <w:t>models.DateTimeField</w:t>
       </w:r>
       <w:proofErr w:type="spellEnd"/>
-      <w:proofErr w:type="gramEnd"/>
       <w:r>
         <w:rPr>
           <w:rFonts w:ascii="Consolas" w:hAnsi="Consolas" w:cs="Times New Roman"/>
@@ -14759,7 +14652,6 @@
         <w:t xml:space="preserve"> = </w:t>
       </w:r>
       <w:proofErr w:type="spellStart"/>
-      <w:proofErr w:type="gramStart"/>
       <w:r>
         <w:rPr>
           <w:rFonts w:ascii="Consolas" w:hAnsi="Consolas" w:cs="Times New Roman"/>
@@ -14769,7 +14661,6 @@
         <w:t>models.DateTimeField</w:t>
       </w:r>
       <w:proofErr w:type="spellEnd"/>
-      <w:proofErr w:type="gramEnd"/>
       <w:r>
         <w:rPr>
           <w:rFonts w:ascii="Consolas" w:hAnsi="Consolas" w:cs="Times New Roman"/>
@@ -14891,7 +14782,6 @@
         <w:t xml:space="preserve">            </w:t>
       </w:r>
       <w:proofErr w:type="spellStart"/>
-      <w:proofErr w:type="gramStart"/>
       <w:r>
         <w:rPr>
           <w:rFonts w:ascii="Consolas" w:hAnsi="Consolas" w:cs="Times New Roman"/>
@@ -14901,7 +14791,6 @@
         <w:t>models.UniqueConstraint</w:t>
       </w:r>
       <w:proofErr w:type="spellEnd"/>
-      <w:proofErr w:type="gramEnd"/>
       <w:r>
         <w:rPr>
           <w:rFonts w:ascii="Consolas" w:hAnsi="Consolas" w:cs="Times New Roman"/>
@@ -14926,25 +14815,7 @@
           <w:sz w:val="22"/>
           <w:lang w:val="en-US"/>
         </w:rPr>
-        <w:t xml:space="preserve">                fields</w:t>
-      </w:r>
-      <w:proofErr w:type="gramStart"/>
-      <w:r>
-        <w:rPr>
-          <w:rFonts w:ascii="Consolas" w:hAnsi="Consolas" w:cs="Times New Roman"/>
-          <w:sz w:val="22"/>
-          <w:lang w:val="en-US"/>
-        </w:rPr>
-        <w:t>=[</w:t>
-      </w:r>
-      <w:proofErr w:type="gramEnd"/>
-      <w:r>
-        <w:rPr>
-          <w:rFonts w:ascii="Consolas" w:hAnsi="Consolas" w:cs="Times New Roman"/>
-          <w:sz w:val="22"/>
-          <w:lang w:val="en-US"/>
-        </w:rPr>
-        <w:t>'user', 'task'],</w:t>
+        <w:t xml:space="preserve">                fields=['user', 'task'],</w:t>
       </w:r>
     </w:p>
     <w:p>
@@ -15105,16 +14976,7 @@
           <w:sz w:val="22"/>
           <w:lang w:val="en-US"/>
         </w:rPr>
-        <w:t>practice_</w:t>
-      </w:r>
-      <w:proofErr w:type="gramStart"/>
-      <w:r>
-        <w:rPr>
-          <w:rFonts w:ascii="Consolas" w:hAnsi="Consolas" w:cs="Times New Roman"/>
-          <w:sz w:val="22"/>
-          <w:lang w:val="en-US"/>
-        </w:rPr>
-        <w:t>detail</w:t>
+        <w:t>practice_detail</w:t>
       </w:r>
       <w:proofErr w:type="spellEnd"/>
       <w:r>
@@ -15123,71 +14985,250 @@
           <w:sz w:val="22"/>
           <w:lang w:val="en-US"/>
         </w:rPr>
+        <w:t>(request, pk):</w:t>
+      </w:r>
+    </w:p>
+    <w:p>
+      <w:pPr>
+        <w:spacing w:after="0" w:line="240" w:lineRule="auto"/>
+        <w:rPr>
+          <w:rFonts w:ascii="Consolas" w:hAnsi="Consolas" w:cs="Times New Roman"/>
+          <w:sz w:val="22"/>
+          <w:lang w:val="en-US"/>
+        </w:rPr>
+      </w:pPr>
+      <w:r>
+        <w:rPr>
+          <w:rFonts w:ascii="Consolas" w:hAnsi="Consolas" w:cs="Times New Roman"/>
+          <w:sz w:val="22"/>
+          <w:lang w:val="en-US"/>
+        </w:rPr>
+        <w:t xml:space="preserve">    task = get_object_or_404(</w:t>
+      </w:r>
+    </w:p>
+    <w:p>
+      <w:pPr>
+        <w:spacing w:after="0" w:line="240" w:lineRule="auto"/>
+        <w:rPr>
+          <w:rFonts w:ascii="Consolas" w:hAnsi="Consolas" w:cs="Times New Roman"/>
+          <w:sz w:val="22"/>
+          <w:lang w:val="en-US"/>
+        </w:rPr>
+      </w:pPr>
+      <w:r>
+        <w:rPr>
+          <w:rFonts w:ascii="Consolas" w:hAnsi="Consolas" w:cs="Times New Roman"/>
+          <w:sz w:val="22"/>
+          <w:lang w:val="en-US"/>
+        </w:rPr>
+        <w:t xml:space="preserve">        </w:t>
+      </w:r>
+      <w:proofErr w:type="spellStart"/>
+      <w:r>
+        <w:rPr>
+          <w:rFonts w:ascii="Consolas" w:hAnsi="Consolas" w:cs="Times New Roman"/>
+          <w:sz w:val="22"/>
+          <w:lang w:val="en-US"/>
+        </w:rPr>
+        <w:t>PracticeTask.objects.select_related</w:t>
+      </w:r>
+      <w:proofErr w:type="spellEnd"/>
+      <w:r>
+        <w:rPr>
+          <w:rFonts w:ascii="Consolas" w:hAnsi="Consolas" w:cs="Times New Roman"/>
+          <w:sz w:val="22"/>
+          <w:lang w:val="en-US"/>
+        </w:rPr>
+        <w:t>('lesson', '</w:t>
+      </w:r>
+      <w:proofErr w:type="spellStart"/>
+      <w:r>
+        <w:rPr>
+          <w:rFonts w:ascii="Consolas" w:hAnsi="Consolas" w:cs="Times New Roman"/>
+          <w:sz w:val="22"/>
+          <w:lang w:val="en-US"/>
+        </w:rPr>
+        <w:t>lesson__module</w:t>
+      </w:r>
+      <w:proofErr w:type="spellEnd"/>
+      <w:r>
+        <w:rPr>
+          <w:rFonts w:ascii="Consolas" w:hAnsi="Consolas" w:cs="Times New Roman"/>
+          <w:sz w:val="22"/>
+          <w:lang w:val="en-US"/>
+        </w:rPr>
+        <w:t>'),</w:t>
+      </w:r>
+    </w:p>
+    <w:p>
+      <w:pPr>
+        <w:spacing w:after="0" w:line="240" w:lineRule="auto"/>
+        <w:rPr>
+          <w:rFonts w:ascii="Consolas" w:hAnsi="Consolas" w:cs="Times New Roman"/>
+          <w:sz w:val="22"/>
+          <w:lang w:val="en-US"/>
+        </w:rPr>
+      </w:pPr>
+      <w:r>
+        <w:rPr>
+          <w:rFonts w:ascii="Consolas" w:hAnsi="Consolas" w:cs="Times New Roman"/>
+          <w:sz w:val="22"/>
+          <w:lang w:val="en-US"/>
+        </w:rPr>
+        <w:t xml:space="preserve">        pk=pk,</w:t>
+      </w:r>
+    </w:p>
+    <w:p>
+      <w:pPr>
+        <w:spacing w:after="0" w:line="240" w:lineRule="auto"/>
+        <w:rPr>
+          <w:rFonts w:ascii="Consolas" w:hAnsi="Consolas" w:cs="Times New Roman"/>
+          <w:sz w:val="22"/>
+          <w:lang w:val="en-US"/>
+        </w:rPr>
+      </w:pPr>
+      <w:r>
+        <w:rPr>
+          <w:rFonts w:ascii="Consolas" w:hAnsi="Consolas" w:cs="Times New Roman"/>
+          <w:sz w:val="22"/>
+          <w:lang w:val="en-US"/>
+        </w:rPr>
+        <w:t xml:space="preserve">        lesson__</w:t>
+      </w:r>
+      <w:proofErr w:type="spellStart"/>
+      <w:r>
+        <w:rPr>
+          <w:rFonts w:ascii="Consolas" w:hAnsi="Consolas" w:cs="Times New Roman"/>
+          <w:sz w:val="22"/>
+          <w:lang w:val="en-US"/>
+        </w:rPr>
+        <w:t>is_published</w:t>
+      </w:r>
+      <w:proofErr w:type="spellEnd"/>
+      <w:r>
+        <w:rPr>
+          <w:rFonts w:ascii="Consolas" w:hAnsi="Consolas" w:cs="Times New Roman"/>
+          <w:sz w:val="22"/>
+          <w:lang w:val="en-US"/>
+        </w:rPr>
+        <w:t>=True,</w:t>
+      </w:r>
+    </w:p>
+    <w:p>
+      <w:pPr>
+        <w:spacing w:after="0" w:line="240" w:lineRule="auto"/>
+        <w:rPr>
+          <w:rFonts w:ascii="Consolas" w:hAnsi="Consolas" w:cs="Times New Roman"/>
+          <w:sz w:val="22"/>
+          <w:lang w:val="en-US"/>
+        </w:rPr>
+      </w:pPr>
+      <w:r>
+        <w:rPr>
+          <w:rFonts w:ascii="Consolas" w:hAnsi="Consolas" w:cs="Times New Roman"/>
+          <w:sz w:val="22"/>
+          <w:lang w:val="en-US"/>
+        </w:rPr>
+        <w:t xml:space="preserve">        lesson__module__</w:t>
+      </w:r>
+      <w:proofErr w:type="spellStart"/>
+      <w:r>
+        <w:rPr>
+          <w:rFonts w:ascii="Consolas" w:hAnsi="Consolas" w:cs="Times New Roman"/>
+          <w:sz w:val="22"/>
+          <w:lang w:val="en-US"/>
+        </w:rPr>
+        <w:t>is_published</w:t>
+      </w:r>
+      <w:proofErr w:type="spellEnd"/>
+      <w:r>
+        <w:rPr>
+          <w:rFonts w:ascii="Consolas" w:hAnsi="Consolas" w:cs="Times New Roman"/>
+          <w:sz w:val="22"/>
+          <w:lang w:val="en-US"/>
+        </w:rPr>
+        <w:t>=True,</w:t>
+      </w:r>
+    </w:p>
+    <w:p>
+      <w:pPr>
+        <w:spacing w:after="0" w:line="240" w:lineRule="auto"/>
+        <w:rPr>
+          <w:rFonts w:ascii="Consolas" w:hAnsi="Consolas" w:cs="Times New Roman"/>
+          <w:sz w:val="22"/>
+          <w:lang w:val="en-US"/>
+        </w:rPr>
+      </w:pPr>
+      <w:r>
+        <w:rPr>
+          <w:rFonts w:ascii="Consolas" w:hAnsi="Consolas" w:cs="Times New Roman"/>
+          <w:sz w:val="22"/>
+          <w:lang w:val="en-US"/>
+        </w:rPr>
+        <w:t xml:space="preserve">    )</w:t>
+      </w:r>
+    </w:p>
+    <w:p>
+      <w:pPr>
+        <w:spacing w:after="0" w:line="240" w:lineRule="auto"/>
+        <w:rPr>
+          <w:rFonts w:ascii="Consolas" w:hAnsi="Consolas" w:cs="Times New Roman"/>
+          <w:sz w:val="22"/>
+          <w:lang w:val="en-US"/>
+        </w:rPr>
+      </w:pPr>
+      <w:r>
+        <w:rPr>
+          <w:rFonts w:ascii="Consolas" w:hAnsi="Consolas" w:cs="Times New Roman"/>
+          <w:sz w:val="22"/>
+          <w:lang w:val="en-US"/>
+        </w:rPr>
+        <w:t xml:space="preserve">    submission = </w:t>
+      </w:r>
+      <w:proofErr w:type="spellStart"/>
+      <w:r>
+        <w:rPr>
+          <w:rFonts w:ascii="Consolas" w:hAnsi="Consolas" w:cs="Times New Roman"/>
+          <w:sz w:val="22"/>
+          <w:lang w:val="en-US"/>
+        </w:rPr>
+        <w:t>PracticeSubmission.objects.filter</w:t>
+      </w:r>
+      <w:proofErr w:type="spellEnd"/>
+      <w:r>
+        <w:rPr>
+          <w:rFonts w:ascii="Consolas" w:hAnsi="Consolas" w:cs="Times New Roman"/>
+          <w:sz w:val="22"/>
+          <w:lang w:val="en-US"/>
+        </w:rPr>
         <w:t>(</w:t>
       </w:r>
-      <w:proofErr w:type="gramEnd"/>
-      <w:r>
-        <w:rPr>
-          <w:rFonts w:ascii="Consolas" w:hAnsi="Consolas" w:cs="Times New Roman"/>
-          <w:sz w:val="22"/>
-          <w:lang w:val="en-US"/>
-        </w:rPr>
-        <w:t>request, pk):</w:t>
-      </w:r>
-    </w:p>
-    <w:p>
-      <w:pPr>
-        <w:spacing w:after="0" w:line="240" w:lineRule="auto"/>
-        <w:rPr>
-          <w:rFonts w:ascii="Consolas" w:hAnsi="Consolas" w:cs="Times New Roman"/>
-          <w:sz w:val="22"/>
-          <w:lang w:val="en-US"/>
-        </w:rPr>
-      </w:pPr>
-      <w:r>
-        <w:rPr>
-          <w:rFonts w:ascii="Consolas" w:hAnsi="Consolas" w:cs="Times New Roman"/>
-          <w:sz w:val="22"/>
-          <w:lang w:val="en-US"/>
-        </w:rPr>
-        <w:t xml:space="preserve">    task = get_object_or_404(</w:t>
-      </w:r>
-    </w:p>
-    <w:p>
-      <w:pPr>
-        <w:spacing w:after="0" w:line="240" w:lineRule="auto"/>
-        <w:rPr>
-          <w:rFonts w:ascii="Consolas" w:hAnsi="Consolas" w:cs="Times New Roman"/>
-          <w:sz w:val="22"/>
-          <w:lang w:val="en-US"/>
-        </w:rPr>
-      </w:pPr>
-      <w:r>
-        <w:rPr>
-          <w:rFonts w:ascii="Consolas" w:hAnsi="Consolas" w:cs="Times New Roman"/>
-          <w:sz w:val="22"/>
-          <w:lang w:val="en-US"/>
-        </w:rPr>
-        <w:t xml:space="preserve">        </w:t>
+    </w:p>
+    <w:p>
+      <w:pPr>
+        <w:spacing w:after="0" w:line="240" w:lineRule="auto"/>
+        <w:rPr>
+          <w:rFonts w:ascii="Consolas" w:hAnsi="Consolas" w:cs="Times New Roman"/>
+          <w:sz w:val="22"/>
+          <w:lang w:val="en-US"/>
+        </w:rPr>
+      </w:pPr>
+      <w:r>
+        <w:rPr>
+          <w:rFonts w:ascii="Consolas" w:hAnsi="Consolas" w:cs="Times New Roman"/>
+          <w:sz w:val="22"/>
+          <w:lang w:val="en-US"/>
+        </w:rPr>
+        <w:t xml:space="preserve">        user=</w:t>
       </w:r>
       <w:proofErr w:type="spellStart"/>
-      <w:proofErr w:type="gramStart"/>
-      <w:r>
-        <w:rPr>
-          <w:rFonts w:ascii="Consolas" w:hAnsi="Consolas" w:cs="Times New Roman"/>
-          <w:sz w:val="22"/>
-          <w:lang w:val="en-US"/>
-        </w:rPr>
-        <w:t>PracticeTask.objects.select</w:t>
-      </w:r>
-      <w:proofErr w:type="gramEnd"/>
-      <w:r>
-        <w:rPr>
-          <w:rFonts w:ascii="Consolas" w:hAnsi="Consolas" w:cs="Times New Roman"/>
-          <w:sz w:val="22"/>
-          <w:lang w:val="en-US"/>
-        </w:rPr>
-        <w:t>_related</w:t>
+      <w:r>
+        <w:rPr>
+          <w:rFonts w:ascii="Consolas" w:hAnsi="Consolas" w:cs="Times New Roman"/>
+          <w:sz w:val="22"/>
+          <w:lang w:val="en-US"/>
+        </w:rPr>
+        <w:t>request.user</w:t>
       </w:r>
       <w:proofErr w:type="spellEnd"/>
       <w:r>
@@ -15196,7 +15237,71 @@
           <w:sz w:val="22"/>
           <w:lang w:val="en-US"/>
         </w:rPr>
-        <w:t>('lesson', '</w:t>
+        <w:t>,</w:t>
+      </w:r>
+    </w:p>
+    <w:p>
+      <w:pPr>
+        <w:spacing w:after="0" w:line="240" w:lineRule="auto"/>
+        <w:rPr>
+          <w:rFonts w:ascii="Consolas" w:hAnsi="Consolas" w:cs="Times New Roman"/>
+          <w:sz w:val="22"/>
+          <w:lang w:val="en-US"/>
+        </w:rPr>
+      </w:pPr>
+      <w:r>
+        <w:rPr>
+          <w:rFonts w:ascii="Consolas" w:hAnsi="Consolas" w:cs="Times New Roman"/>
+          <w:sz w:val="22"/>
+          <w:lang w:val="en-US"/>
+        </w:rPr>
+        <w:t xml:space="preserve">        task=task,</w:t>
+      </w:r>
+    </w:p>
+    <w:p>
+      <w:pPr>
+        <w:spacing w:after="0" w:line="240" w:lineRule="auto"/>
+        <w:rPr>
+          <w:rFonts w:ascii="Consolas" w:hAnsi="Consolas" w:cs="Times New Roman"/>
+          <w:sz w:val="22"/>
+          <w:lang w:val="en-US"/>
+        </w:rPr>
+      </w:pPr>
+      <w:r>
+        <w:rPr>
+          <w:rFonts w:ascii="Consolas" w:hAnsi="Consolas" w:cs="Times New Roman"/>
+          <w:sz w:val="22"/>
+          <w:lang w:val="en-US"/>
+        </w:rPr>
+        <w:t xml:space="preserve">    ).first()</w:t>
+      </w:r>
+    </w:p>
+    <w:p>
+      <w:pPr>
+        <w:spacing w:after="0" w:line="240" w:lineRule="auto"/>
+        <w:rPr>
+          <w:rFonts w:ascii="Consolas" w:hAnsi="Consolas" w:cs="Times New Roman"/>
+          <w:sz w:val="22"/>
+          <w:lang w:val="en-US"/>
+        </w:rPr>
+      </w:pPr>
+    </w:p>
+    <w:p>
+      <w:pPr>
+        <w:spacing w:after="0" w:line="240" w:lineRule="auto"/>
+        <w:rPr>
+          <w:rFonts w:ascii="Consolas" w:hAnsi="Consolas" w:cs="Times New Roman"/>
+          <w:sz w:val="22"/>
+          <w:lang w:val="en-US"/>
+        </w:rPr>
+      </w:pPr>
+      <w:r>
+        <w:rPr>
+          <w:rFonts w:ascii="Consolas" w:hAnsi="Consolas" w:cs="Times New Roman"/>
+          <w:sz w:val="22"/>
+          <w:lang w:val="en-US"/>
+        </w:rPr>
+        <w:t xml:space="preserve">    if </w:t>
       </w:r>
       <w:proofErr w:type="spellStart"/>
       <w:r>
@@ -15205,7 +15310,7 @@
           <w:sz w:val="22"/>
           <w:lang w:val="en-US"/>
         </w:rPr>
-        <w:t>lesson__module</w:t>
+        <w:t>request.method</w:t>
       </w:r>
       <w:proofErr w:type="spellEnd"/>
       <w:r>
@@ -15214,43 +15319,25 @@
           <w:sz w:val="22"/>
           <w:lang w:val="en-US"/>
         </w:rPr>
-        <w:t>'),</w:t>
-      </w:r>
-    </w:p>
-    <w:p>
-      <w:pPr>
-        <w:spacing w:after="0" w:line="240" w:lineRule="auto"/>
-        <w:rPr>
-          <w:rFonts w:ascii="Consolas" w:hAnsi="Consolas" w:cs="Times New Roman"/>
-          <w:sz w:val="22"/>
-          <w:lang w:val="en-US"/>
-        </w:rPr>
-      </w:pPr>
-      <w:r>
-        <w:rPr>
-          <w:rFonts w:ascii="Consolas" w:hAnsi="Consolas" w:cs="Times New Roman"/>
-          <w:sz w:val="22"/>
-          <w:lang w:val="en-US"/>
-        </w:rPr>
-        <w:t xml:space="preserve">        pk=pk,</w:t>
-      </w:r>
-    </w:p>
-    <w:p>
-      <w:pPr>
-        <w:spacing w:after="0" w:line="240" w:lineRule="auto"/>
-        <w:rPr>
-          <w:rFonts w:ascii="Consolas" w:hAnsi="Consolas" w:cs="Times New Roman"/>
-          <w:sz w:val="22"/>
-          <w:lang w:val="en-US"/>
-        </w:rPr>
-      </w:pPr>
-      <w:r>
-        <w:rPr>
-          <w:rFonts w:ascii="Consolas" w:hAnsi="Consolas" w:cs="Times New Roman"/>
-          <w:sz w:val="22"/>
-          <w:lang w:val="en-US"/>
-        </w:rPr>
-        <w:t xml:space="preserve">        lesson__</w:t>
+        <w:t xml:space="preserve"> == 'POST':</w:t>
+      </w:r>
+    </w:p>
+    <w:p>
+      <w:pPr>
+        <w:spacing w:after="0" w:line="240" w:lineRule="auto"/>
+        <w:rPr>
+          <w:rFonts w:ascii="Consolas" w:hAnsi="Consolas" w:cs="Times New Roman"/>
+          <w:sz w:val="22"/>
+          <w:lang w:val="en-US"/>
+        </w:rPr>
+      </w:pPr>
+      <w:r>
+        <w:rPr>
+          <w:rFonts w:ascii="Consolas" w:hAnsi="Consolas" w:cs="Times New Roman"/>
+          <w:sz w:val="22"/>
+          <w:lang w:val="en-US"/>
+        </w:rPr>
+        <w:t xml:space="preserve">        form = </w:t>
       </w:r>
       <w:proofErr w:type="spellStart"/>
       <w:r>
@@ -15259,7 +15346,7 @@
           <w:sz w:val="22"/>
           <w:lang w:val="en-US"/>
         </w:rPr>
-        <w:t>is_published</w:t>
+        <w:t>PracticeSubmissionForm</w:t>
       </w:r>
       <w:proofErr w:type="spellEnd"/>
       <w:r>
@@ -15268,25 +15355,25 @@
           <w:sz w:val="22"/>
           <w:lang w:val="en-US"/>
         </w:rPr>
-        <w:t>=True,</w:t>
-      </w:r>
-    </w:p>
-    <w:p>
-      <w:pPr>
-        <w:spacing w:after="0" w:line="240" w:lineRule="auto"/>
-        <w:rPr>
-          <w:rFonts w:ascii="Consolas" w:hAnsi="Consolas" w:cs="Times New Roman"/>
-          <w:sz w:val="22"/>
-          <w:lang w:val="en-US"/>
-        </w:rPr>
-      </w:pPr>
-      <w:r>
-        <w:rPr>
-          <w:rFonts w:ascii="Consolas" w:hAnsi="Consolas" w:cs="Times New Roman"/>
-          <w:sz w:val="22"/>
-          <w:lang w:val="en-US"/>
-        </w:rPr>
-        <w:t xml:space="preserve">        lesson__module__</w:t>
+        <w:t>(</w:t>
+      </w:r>
+    </w:p>
+    <w:p>
+      <w:pPr>
+        <w:spacing w:after="0" w:line="240" w:lineRule="auto"/>
+        <w:rPr>
+          <w:rFonts w:ascii="Consolas" w:hAnsi="Consolas" w:cs="Times New Roman"/>
+          <w:sz w:val="22"/>
+          <w:lang w:val="en-US"/>
+        </w:rPr>
+      </w:pPr>
+      <w:r>
+        <w:rPr>
+          <w:rFonts w:ascii="Consolas" w:hAnsi="Consolas" w:cs="Times New Roman"/>
+          <w:sz w:val="22"/>
+          <w:lang w:val="en-US"/>
+        </w:rPr>
+        <w:t xml:space="preserve">            </w:t>
       </w:r>
       <w:proofErr w:type="spellStart"/>
       <w:r>
@@ -15295,7 +15382,7 @@
           <w:sz w:val="22"/>
           <w:lang w:val="en-US"/>
         </w:rPr>
-        <w:t>is_published</w:t>
+        <w:t>request.POST</w:t>
       </w:r>
       <w:proofErr w:type="spellEnd"/>
       <w:r>
@@ -15304,306 +15391,36 @@
           <w:sz w:val="22"/>
           <w:lang w:val="en-US"/>
         </w:rPr>
-        <w:t>=True,</w:t>
-      </w:r>
-    </w:p>
-    <w:p>
-      <w:pPr>
-        <w:spacing w:after="0" w:line="240" w:lineRule="auto"/>
-        <w:rPr>
-          <w:rFonts w:ascii="Consolas" w:hAnsi="Consolas" w:cs="Times New Roman"/>
-          <w:sz w:val="22"/>
-          <w:lang w:val="en-US"/>
-        </w:rPr>
-      </w:pPr>
-      <w:r>
-        <w:rPr>
-          <w:rFonts w:ascii="Consolas" w:hAnsi="Consolas" w:cs="Times New Roman"/>
-          <w:sz w:val="22"/>
-          <w:lang w:val="en-US"/>
-        </w:rPr>
-        <w:t xml:space="preserve">    )</w:t>
-      </w:r>
-    </w:p>
-    <w:p>
-      <w:pPr>
-        <w:spacing w:after="0" w:line="240" w:lineRule="auto"/>
-        <w:rPr>
-          <w:rFonts w:ascii="Consolas" w:hAnsi="Consolas" w:cs="Times New Roman"/>
-          <w:sz w:val="22"/>
-          <w:lang w:val="en-US"/>
-        </w:rPr>
-      </w:pPr>
-      <w:r>
-        <w:rPr>
-          <w:rFonts w:ascii="Consolas" w:hAnsi="Consolas" w:cs="Times New Roman"/>
-          <w:sz w:val="22"/>
-          <w:lang w:val="en-US"/>
-        </w:rPr>
-        <w:t xml:space="preserve">    submission = </w:t>
+        <w:t>,</w:t>
+      </w:r>
+    </w:p>
+    <w:p>
+      <w:pPr>
+        <w:spacing w:after="0" w:line="240" w:lineRule="auto"/>
+        <w:rPr>
+          <w:rFonts w:ascii="Consolas" w:hAnsi="Consolas" w:cs="Times New Roman"/>
+          <w:sz w:val="22"/>
+          <w:lang w:val="en-US"/>
+        </w:rPr>
+      </w:pPr>
+      <w:r>
+        <w:rPr>
+          <w:rFonts w:ascii="Consolas" w:hAnsi="Consolas" w:cs="Times New Roman"/>
+          <w:sz w:val="22"/>
+          <w:lang w:val="en-US"/>
+        </w:rPr>
+        <w:t xml:space="preserve">            </w:t>
       </w:r>
       <w:proofErr w:type="spellStart"/>
-      <w:proofErr w:type="gramStart"/>
-      <w:r>
-        <w:rPr>
-          <w:rFonts w:ascii="Consolas" w:hAnsi="Consolas" w:cs="Times New Roman"/>
-          <w:sz w:val="22"/>
-          <w:lang w:val="en-US"/>
-        </w:rPr>
-        <w:t>PracticeSubmission.objects.filter</w:t>
+      <w:r>
+        <w:rPr>
+          <w:rFonts w:ascii="Consolas" w:hAnsi="Consolas" w:cs="Times New Roman"/>
+          <w:sz w:val="22"/>
+          <w:lang w:val="en-US"/>
+        </w:rPr>
+        <w:t>request.FILES</w:t>
       </w:r>
       <w:proofErr w:type="spellEnd"/>
-      <w:proofErr w:type="gramEnd"/>
-      <w:r>
-        <w:rPr>
-          <w:rFonts w:ascii="Consolas" w:hAnsi="Consolas" w:cs="Times New Roman"/>
-          <w:sz w:val="22"/>
-          <w:lang w:val="en-US"/>
-        </w:rPr>
-        <w:t>(</w:t>
-      </w:r>
-    </w:p>
-    <w:p>
-      <w:pPr>
-        <w:spacing w:after="0" w:line="240" w:lineRule="auto"/>
-        <w:rPr>
-          <w:rFonts w:ascii="Consolas" w:hAnsi="Consolas" w:cs="Times New Roman"/>
-          <w:sz w:val="22"/>
-          <w:lang w:val="en-US"/>
-        </w:rPr>
-      </w:pPr>
-      <w:r>
-        <w:rPr>
-          <w:rFonts w:ascii="Consolas" w:hAnsi="Consolas" w:cs="Times New Roman"/>
-          <w:sz w:val="22"/>
-          <w:lang w:val="en-US"/>
-        </w:rPr>
-        <w:t xml:space="preserve">        user=</w:t>
-      </w:r>
-      <w:proofErr w:type="spellStart"/>
-      <w:r>
-        <w:rPr>
-          <w:rFonts w:ascii="Consolas" w:hAnsi="Consolas" w:cs="Times New Roman"/>
-          <w:sz w:val="22"/>
-          <w:lang w:val="en-US"/>
-        </w:rPr>
-        <w:t>request.user</w:t>
-      </w:r>
-      <w:proofErr w:type="spellEnd"/>
-      <w:r>
-        <w:rPr>
-          <w:rFonts w:ascii="Consolas" w:hAnsi="Consolas" w:cs="Times New Roman"/>
-          <w:sz w:val="22"/>
-          <w:lang w:val="en-US"/>
-        </w:rPr>
-        <w:t>,</w:t>
-      </w:r>
-    </w:p>
-    <w:p>
-      <w:pPr>
-        <w:spacing w:after="0" w:line="240" w:lineRule="auto"/>
-        <w:rPr>
-          <w:rFonts w:ascii="Consolas" w:hAnsi="Consolas" w:cs="Times New Roman"/>
-          <w:sz w:val="22"/>
-          <w:lang w:val="en-US"/>
-        </w:rPr>
-      </w:pPr>
-      <w:r>
-        <w:rPr>
-          <w:rFonts w:ascii="Consolas" w:hAnsi="Consolas" w:cs="Times New Roman"/>
-          <w:sz w:val="22"/>
-          <w:lang w:val="en-US"/>
-        </w:rPr>
-        <w:t xml:space="preserve">        task=task,</w:t>
-      </w:r>
-    </w:p>
-    <w:p>
-      <w:pPr>
-        <w:spacing w:after="0" w:line="240" w:lineRule="auto"/>
-        <w:rPr>
-          <w:rFonts w:ascii="Consolas" w:hAnsi="Consolas" w:cs="Times New Roman"/>
-          <w:sz w:val="22"/>
-          <w:lang w:val="en-US"/>
-        </w:rPr>
-      </w:pPr>
-      <w:r>
-        <w:rPr>
-          <w:rFonts w:ascii="Consolas" w:hAnsi="Consolas" w:cs="Times New Roman"/>
-          <w:sz w:val="22"/>
-          <w:lang w:val="en-US"/>
-        </w:rPr>
-        <w:t xml:space="preserve">    </w:t>
-      </w:r>
-      <w:proofErr w:type="gramStart"/>
-      <w:r>
-        <w:rPr>
-          <w:rFonts w:ascii="Consolas" w:hAnsi="Consolas" w:cs="Times New Roman"/>
-          <w:sz w:val="22"/>
-          <w:lang w:val="en-US"/>
-        </w:rPr>
-        <w:t>).first</w:t>
-      </w:r>
-      <w:proofErr w:type="gramEnd"/>
-      <w:r>
-        <w:rPr>
-          <w:rFonts w:ascii="Consolas" w:hAnsi="Consolas" w:cs="Times New Roman"/>
-          <w:sz w:val="22"/>
-          <w:lang w:val="en-US"/>
-        </w:rPr>
-        <w:t>()</w:t>
-      </w:r>
-    </w:p>
-    <w:p>
-      <w:pPr>
-        <w:spacing w:after="0" w:line="240" w:lineRule="auto"/>
-        <w:rPr>
-          <w:rFonts w:ascii="Consolas" w:hAnsi="Consolas" w:cs="Times New Roman"/>
-          <w:sz w:val="22"/>
-          <w:lang w:val="en-US"/>
-        </w:rPr>
-      </w:pPr>
-    </w:p>
-    <w:p>
-      <w:pPr>
-        <w:spacing w:after="0" w:line="240" w:lineRule="auto"/>
-        <w:rPr>
-          <w:rFonts w:ascii="Consolas" w:hAnsi="Consolas" w:cs="Times New Roman"/>
-          <w:sz w:val="22"/>
-          <w:lang w:val="en-US"/>
-        </w:rPr>
-      </w:pPr>
-      <w:r>
-        <w:rPr>
-          <w:rFonts w:ascii="Consolas" w:hAnsi="Consolas" w:cs="Times New Roman"/>
-          <w:sz w:val="22"/>
-          <w:lang w:val="en-US"/>
-        </w:rPr>
-        <w:t xml:space="preserve">    if </w:t>
-      </w:r>
-      <w:proofErr w:type="spellStart"/>
-      <w:proofErr w:type="gramStart"/>
-      <w:r>
-        <w:rPr>
-          <w:rFonts w:ascii="Consolas" w:hAnsi="Consolas" w:cs="Times New Roman"/>
-          <w:sz w:val="22"/>
-          <w:lang w:val="en-US"/>
-        </w:rPr>
-        <w:t>request.method</w:t>
-      </w:r>
-      <w:proofErr w:type="spellEnd"/>
-      <w:proofErr w:type="gramEnd"/>
-      <w:r>
-        <w:rPr>
-          <w:rFonts w:ascii="Consolas" w:hAnsi="Consolas" w:cs="Times New Roman"/>
-          <w:sz w:val="22"/>
-          <w:lang w:val="en-US"/>
-        </w:rPr>
-        <w:t xml:space="preserve"> == 'POST':</w:t>
-      </w:r>
-    </w:p>
-    <w:p>
-      <w:pPr>
-        <w:spacing w:after="0" w:line="240" w:lineRule="auto"/>
-        <w:rPr>
-          <w:rFonts w:ascii="Consolas" w:hAnsi="Consolas" w:cs="Times New Roman"/>
-          <w:sz w:val="22"/>
-          <w:lang w:val="en-US"/>
-        </w:rPr>
-      </w:pPr>
-      <w:r>
-        <w:rPr>
-          <w:rFonts w:ascii="Consolas" w:hAnsi="Consolas" w:cs="Times New Roman"/>
-          <w:sz w:val="22"/>
-          <w:lang w:val="en-US"/>
-        </w:rPr>
-        <w:t xml:space="preserve">        form = </w:t>
-      </w:r>
-      <w:proofErr w:type="spellStart"/>
-      <w:proofErr w:type="gramStart"/>
-      <w:r>
-        <w:rPr>
-          <w:rFonts w:ascii="Consolas" w:hAnsi="Consolas" w:cs="Times New Roman"/>
-          <w:sz w:val="22"/>
-          <w:lang w:val="en-US"/>
-        </w:rPr>
-        <w:t>PracticeSubmissionForm</w:t>
-      </w:r>
-      <w:proofErr w:type="spellEnd"/>
-      <w:r>
-        <w:rPr>
-          <w:rFonts w:ascii="Consolas" w:hAnsi="Consolas" w:cs="Times New Roman"/>
-          <w:sz w:val="22"/>
-          <w:lang w:val="en-US"/>
-        </w:rPr>
-        <w:t>(</w:t>
-      </w:r>
-      <w:proofErr w:type="gramEnd"/>
-    </w:p>
-    <w:p>
-      <w:pPr>
-        <w:spacing w:after="0" w:line="240" w:lineRule="auto"/>
-        <w:rPr>
-          <w:rFonts w:ascii="Consolas" w:hAnsi="Consolas" w:cs="Times New Roman"/>
-          <w:sz w:val="22"/>
-          <w:lang w:val="en-US"/>
-        </w:rPr>
-      </w:pPr>
-      <w:r>
-        <w:rPr>
-          <w:rFonts w:ascii="Consolas" w:hAnsi="Consolas" w:cs="Times New Roman"/>
-          <w:sz w:val="22"/>
-          <w:lang w:val="en-US"/>
-        </w:rPr>
-        <w:t xml:space="preserve">            </w:t>
-      </w:r>
-      <w:proofErr w:type="spellStart"/>
-      <w:r>
-        <w:rPr>
-          <w:rFonts w:ascii="Consolas" w:hAnsi="Consolas" w:cs="Times New Roman"/>
-          <w:sz w:val="22"/>
-          <w:lang w:val="en-US"/>
-        </w:rPr>
-        <w:t>request.POST</w:t>
-      </w:r>
-      <w:proofErr w:type="spellEnd"/>
-      <w:r>
-        <w:rPr>
-          <w:rFonts w:ascii="Consolas" w:hAnsi="Consolas" w:cs="Times New Roman"/>
-          <w:sz w:val="22"/>
-          <w:lang w:val="en-US"/>
-        </w:rPr>
-        <w:t>,</w:t>
-      </w:r>
-    </w:p>
-    <w:p>
-      <w:pPr>
-        <w:spacing w:after="0" w:line="240" w:lineRule="auto"/>
-        <w:rPr>
-          <w:rFonts w:ascii="Consolas" w:hAnsi="Consolas" w:cs="Times New Roman"/>
-          <w:sz w:val="22"/>
-          <w:lang w:val="en-US"/>
-        </w:rPr>
-      </w:pPr>
-      <w:r>
-        <w:rPr>
-          <w:rFonts w:ascii="Consolas" w:hAnsi="Consolas" w:cs="Times New Roman"/>
-          <w:sz w:val="22"/>
-          <w:lang w:val="en-US"/>
-        </w:rPr>
-        <w:t xml:space="preserve">            </w:t>
-      </w:r>
-      <w:proofErr w:type="spellStart"/>
-      <w:proofErr w:type="gramStart"/>
-      <w:r>
-        <w:rPr>
-          <w:rFonts w:ascii="Consolas" w:hAnsi="Consolas" w:cs="Times New Roman"/>
-          <w:sz w:val="22"/>
-          <w:lang w:val="en-US"/>
-        </w:rPr>
-        <w:t>request.FILES</w:t>
-      </w:r>
-      <w:proofErr w:type="spellEnd"/>
-      <w:proofErr w:type="gramEnd"/>
       <w:r>
         <w:rPr>
           <w:rFonts w:ascii="Consolas" w:hAnsi="Consolas" w:cs="Times New Roman"/>
@@ -15674,16 +15491,7 @@
           <w:sz w:val="22"/>
           <w:lang w:val="en-US"/>
         </w:rPr>
-        <w:t>form.is_</w:t>
-      </w:r>
-      <w:proofErr w:type="gramStart"/>
-      <w:r>
-        <w:rPr>
-          <w:rFonts w:ascii="Consolas" w:hAnsi="Consolas" w:cs="Times New Roman"/>
-          <w:sz w:val="22"/>
-          <w:lang w:val="en-US"/>
-        </w:rPr>
-        <w:t>valid</w:t>
+        <w:t>form.is_valid</w:t>
       </w:r>
       <w:proofErr w:type="spellEnd"/>
       <w:r>
@@ -15692,16 +15500,7 @@
           <w:sz w:val="22"/>
           <w:lang w:val="en-US"/>
         </w:rPr>
-        <w:t>(</w:t>
-      </w:r>
-      <w:proofErr w:type="gramEnd"/>
-      <w:r>
-        <w:rPr>
-          <w:rFonts w:ascii="Consolas" w:hAnsi="Consolas" w:cs="Times New Roman"/>
-          <w:sz w:val="22"/>
-          <w:lang w:val="en-US"/>
-        </w:rPr>
-        <w:t>):</w:t>
+        <w:t>():</w:t>
       </w:r>
     </w:p>
     <w:p>
@@ -15722,7 +15521,6 @@
         <w:t xml:space="preserve">            submission = </w:t>
       </w:r>
       <w:proofErr w:type="spellStart"/>
-      <w:proofErr w:type="gramStart"/>
       <w:r>
         <w:rPr>
           <w:rFonts w:ascii="Consolas" w:hAnsi="Consolas" w:cs="Times New Roman"/>
@@ -15732,7 +15530,6 @@
         <w:t>form.save</w:t>
       </w:r>
       <w:proofErr w:type="spellEnd"/>
-      <w:proofErr w:type="gramEnd"/>
       <w:r>
         <w:rPr>
           <w:rFonts w:ascii="Consolas" w:hAnsi="Consolas" w:cs="Times New Roman"/>
@@ -15806,7 +15603,6 @@
         <w:t xml:space="preserve">            </w:t>
       </w:r>
       <w:proofErr w:type="spellStart"/>
-      <w:proofErr w:type="gramStart"/>
       <w:r>
         <w:rPr>
           <w:rFonts w:ascii="Consolas" w:hAnsi="Consolas" w:cs="Times New Roman"/>
@@ -15816,7 +15612,6 @@
         <w:t>submission.task</w:t>
       </w:r>
       <w:proofErr w:type="spellEnd"/>
-      <w:proofErr w:type="gramEnd"/>
       <w:r>
         <w:rPr>
           <w:rFonts w:ascii="Consolas" w:hAnsi="Consolas" w:cs="Times New Roman"/>
@@ -15880,7 +15675,6 @@
         <w:t xml:space="preserve">            </w:t>
       </w:r>
       <w:proofErr w:type="spellStart"/>
-      <w:proofErr w:type="gramStart"/>
       <w:r>
         <w:rPr>
           <w:rFonts w:ascii="Consolas" w:hAnsi="Consolas" w:cs="Times New Roman"/>
@@ -15890,7 +15684,6 @@
         <w:t>submission.save</w:t>
       </w:r>
       <w:proofErr w:type="spellEnd"/>
-      <w:proofErr w:type="gramEnd"/>
       <w:r>
         <w:rPr>
           <w:rFonts w:ascii="Consolas" w:hAnsi="Consolas" w:cs="Times New Roman"/>
@@ -15918,7 +15711,6 @@
         <w:t xml:space="preserve">            </w:t>
       </w:r>
       <w:proofErr w:type="spellStart"/>
-      <w:proofErr w:type="gramStart"/>
       <w:r>
         <w:rPr>
           <w:rFonts w:ascii="Consolas" w:hAnsi="Consolas" w:cs="Times New Roman"/>
@@ -15928,7 +15720,6 @@
         <w:t>messages.success</w:t>
       </w:r>
       <w:proofErr w:type="spellEnd"/>
-      <w:proofErr w:type="gramEnd"/>
       <w:r>
         <w:rPr>
           <w:rFonts w:ascii="Consolas" w:hAnsi="Consolas" w:cs="Times New Roman"/>
@@ -16088,25 +15879,7 @@
           <w:sz w:val="22"/>
           <w:lang w:val="en-US"/>
         </w:rPr>
-        <w:t xml:space="preserve">    return </w:t>
-      </w:r>
-      <w:proofErr w:type="gramStart"/>
-      <w:r>
-        <w:rPr>
-          <w:rFonts w:ascii="Consolas" w:hAnsi="Consolas" w:cs="Times New Roman"/>
-          <w:sz w:val="22"/>
-          <w:lang w:val="en-US"/>
-        </w:rPr>
-        <w:t>render(</w:t>
-      </w:r>
-      <w:proofErr w:type="gramEnd"/>
-      <w:r>
-        <w:rPr>
-          <w:rFonts w:ascii="Consolas" w:hAnsi="Consolas" w:cs="Times New Roman"/>
-          <w:sz w:val="22"/>
-          <w:lang w:val="en-US"/>
-        </w:rPr>
-        <w:t>request, 'learning/practice_detail.html', {</w:t>
+        <w:t xml:space="preserve">    return render(request, 'learning/practice_detail.html', {</w:t>
       </w:r>
     </w:p>
     <w:p>
@@ -16241,25 +16014,7 @@
           <w:sz w:val="22"/>
           <w:lang w:val="en-US"/>
         </w:rPr>
-        <w:t xml:space="preserve">percent = </w:t>
-      </w:r>
-      <w:proofErr w:type="gramStart"/>
-      <w:r>
-        <w:rPr>
-          <w:rFonts w:ascii="Consolas" w:hAnsi="Consolas" w:cs="Times New Roman"/>
-          <w:sz w:val="22"/>
-          <w:lang w:val="en-US"/>
-        </w:rPr>
-        <w:t>round(</w:t>
-      </w:r>
-      <w:proofErr w:type="gramEnd"/>
-      <w:r>
-        <w:rPr>
-          <w:rFonts w:ascii="Consolas" w:hAnsi="Consolas" w:cs="Times New Roman"/>
-          <w:sz w:val="22"/>
-          <w:lang w:val="en-US"/>
-        </w:rPr>
-        <w:t xml:space="preserve">(score / </w:t>
+        <w:t xml:space="preserve">percent = round((score / </w:t>
       </w:r>
       <w:proofErr w:type="spellStart"/>
       <w:r>
@@ -16326,7 +16081,6 @@
         <w:t xml:space="preserve">with </w:t>
       </w:r>
       <w:proofErr w:type="spellStart"/>
-      <w:proofErr w:type="gramStart"/>
       <w:r>
         <w:rPr>
           <w:rFonts w:ascii="Consolas" w:hAnsi="Consolas" w:cs="Times New Roman"/>
@@ -16336,7 +16090,6 @@
         <w:t>transaction.atomic</w:t>
       </w:r>
       <w:proofErr w:type="spellEnd"/>
-      <w:proofErr w:type="gramEnd"/>
       <w:r>
         <w:rPr>
           <w:rFonts w:ascii="Consolas" w:hAnsi="Consolas" w:cs="Times New Roman"/>
@@ -16364,7 +16117,6 @@
         <w:t xml:space="preserve">    attempt = </w:t>
       </w:r>
       <w:proofErr w:type="spellStart"/>
-      <w:proofErr w:type="gramStart"/>
       <w:r>
         <w:rPr>
           <w:rFonts w:ascii="Consolas" w:hAnsi="Consolas" w:cs="Times New Roman"/>
@@ -16374,7 +16126,6 @@
         <w:t>TestAttempt.objects.create</w:t>
       </w:r>
       <w:proofErr w:type="spellEnd"/>
-      <w:proofErr w:type="gramEnd"/>
       <w:r>
         <w:rPr>
           <w:rFonts w:ascii="Consolas" w:hAnsi="Consolas" w:cs="Times New Roman"/>
@@ -16588,25 +16339,7 @@
           <w:sz w:val="22"/>
           <w:lang w:val="en-US"/>
         </w:rPr>
-        <w:t>knowledge_</w:t>
-      </w:r>
-      <w:proofErr w:type="gramStart"/>
-      <w:r>
-        <w:rPr>
-          <w:rFonts w:ascii="Consolas" w:hAnsi="Consolas" w:cs="Times New Roman"/>
-          <w:sz w:val="22"/>
-          <w:lang w:val="en-US"/>
-        </w:rPr>
-        <w:t>test.passing</w:t>
-      </w:r>
-      <w:proofErr w:type="gramEnd"/>
-      <w:r>
-        <w:rPr>
-          <w:rFonts w:ascii="Consolas" w:hAnsi="Consolas" w:cs="Times New Roman"/>
-          <w:sz w:val="22"/>
-          <w:lang w:val="en-US"/>
-        </w:rPr>
-        <w:t>_percent</w:t>
+        <w:t>knowledge_test.passing_percent</w:t>
       </w:r>
       <w:proofErr w:type="spellEnd"/>
       <w:r>
@@ -16664,23 +16397,13 @@
         <w:t xml:space="preserve">    </w:t>
       </w:r>
       <w:proofErr w:type="spellStart"/>
-      <w:proofErr w:type="gramStart"/>
-      <w:r>
-        <w:rPr>
-          <w:rFonts w:ascii="Consolas" w:hAnsi="Consolas" w:cs="Times New Roman"/>
-          <w:sz w:val="22"/>
-          <w:lang w:val="en-US"/>
-        </w:rPr>
-        <w:t>TestAttemptAnswer.objects.bulk</w:t>
-      </w:r>
-      <w:proofErr w:type="gramEnd"/>
-      <w:r>
-        <w:rPr>
-          <w:rFonts w:ascii="Consolas" w:hAnsi="Consolas" w:cs="Times New Roman"/>
-          <w:sz w:val="22"/>
-          <w:lang w:val="en-US"/>
-        </w:rPr>
-        <w:t>_create</w:t>
+      <w:r>
+        <w:rPr>
+          <w:rFonts w:ascii="Consolas" w:hAnsi="Consolas" w:cs="Times New Roman"/>
+          <w:sz w:val="22"/>
+          <w:lang w:val="en-US"/>
+        </w:rPr>
+        <w:t>TestAttemptAnswer.objects.bulk_create</w:t>
       </w:r>
       <w:proofErr w:type="spellEnd"/>
       <w:r>
@@ -16728,7 +16451,6 @@
         <w:t xml:space="preserve">            </w:t>
       </w:r>
       <w:proofErr w:type="spellStart"/>
-      <w:proofErr w:type="gramStart"/>
       <w:r>
         <w:rPr>
           <w:rFonts w:ascii="Consolas" w:hAnsi="Consolas" w:cs="Times New Roman"/>
@@ -16746,7 +16468,6 @@
         </w:rPr>
         <w:t>(</w:t>
       </w:r>
-      <w:proofErr w:type="gramEnd"/>
     </w:p>
     <w:p>
       <w:pPr>
@@ -16919,7 +16640,6 @@
         <w:t>selected_answer_text</w:t>
       </w:r>
       <w:proofErr w:type="spellEnd"/>
-      <w:proofErr w:type="gramStart"/>
       <w:r>
         <w:rPr>
           <w:rFonts w:ascii="Consolas" w:hAnsi="Consolas" w:cs="Times New Roman"/>
@@ -16928,7 +16648,6 @@
         </w:rPr>
         <w:t>=(</w:t>
       </w:r>
-      <w:proofErr w:type="gramEnd"/>
     </w:p>
     <w:p>
       <w:pPr>
@@ -17071,18 +16790,8 @@
           <w:sz w:val="22"/>
           <w:lang w:val="en-US"/>
         </w:rPr>
-        <w:t>=</w:t>
-      </w:r>
-      <w:proofErr w:type="gramStart"/>
-      <w:r>
-        <w:rPr>
-          <w:rFonts w:ascii="Consolas" w:hAnsi="Consolas" w:cs="Times New Roman"/>
-          <w:sz w:val="22"/>
-          <w:lang w:val="en-US"/>
-        </w:rPr>
-        <w:t>bool(</w:t>
-      </w:r>
-      <w:proofErr w:type="gramEnd"/>
+        <w:t>=bool(</w:t>
+      </w:r>
     </w:p>
     <w:p>
       <w:pPr>
@@ -17172,6 +16881,7 @@
         <w:rPr>
           <w:rFonts w:ascii="Consolas" w:hAnsi="Consolas" w:cs="Times New Roman"/>
           <w:sz w:val="22"/>
+          <w:lang w:val="en-US"/>
         </w:rPr>
       </w:pPr>
       <w:r>
@@ -17186,6 +16896,7 @@
         <w:rPr>
           <w:rFonts w:ascii="Consolas" w:hAnsi="Consolas" w:cs="Times New Roman"/>
           <w:sz w:val="22"/>
+          <w:lang w:val="en-US"/>
         </w:rPr>
         <w:t>),</w:t>
       </w:r>
@@ -17196,12 +16907,14 @@
         <w:rPr>
           <w:rFonts w:ascii="Consolas" w:hAnsi="Consolas" w:cs="Times New Roman"/>
           <w:sz w:val="22"/>
-        </w:rPr>
-      </w:pPr>
-      <w:r>
-        <w:rPr>
-          <w:rFonts w:ascii="Consolas" w:hAnsi="Consolas" w:cs="Times New Roman"/>
-          <w:sz w:val="22"/>
+          <w:lang w:val="en-US"/>
+        </w:rPr>
+      </w:pPr>
+      <w:r>
+        <w:rPr>
+          <w:rFonts w:ascii="Consolas" w:hAnsi="Consolas" w:cs="Times New Roman"/>
+          <w:sz w:val="22"/>
+          <w:lang w:val="en-US"/>
         </w:rPr>
         <w:t xml:space="preserve">            )</w:t>
       </w:r>
@@ -17212,85 +16925,32 @@
         <w:rPr>
           <w:rFonts w:ascii="Consolas" w:hAnsi="Consolas" w:cs="Times New Roman"/>
           <w:sz w:val="22"/>
-        </w:rPr>
-      </w:pPr>
-      <w:r>
-        <w:rPr>
-          <w:rFonts w:ascii="Consolas" w:hAnsi="Consolas" w:cs="Times New Roman"/>
-          <w:sz w:val="22"/>
-        </w:rPr>
-        <w:t xml:space="preserve">            </w:t>
-      </w:r>
-      <w:proofErr w:type="spellStart"/>
-      <w:r>
-        <w:rPr>
-          <w:rFonts w:ascii="Consolas" w:hAnsi="Consolas" w:cs="Times New Roman"/>
-          <w:sz w:val="22"/>
-        </w:rPr>
-        <w:t>for</w:t>
-      </w:r>
-      <w:proofErr w:type="spellEnd"/>
-      <w:r>
-        <w:rPr>
-          <w:rFonts w:ascii="Consolas" w:hAnsi="Consolas" w:cs="Times New Roman"/>
-          <w:sz w:val="22"/>
-        </w:rPr>
-        <w:t xml:space="preserve"> </w:t>
-      </w:r>
-      <w:proofErr w:type="spellStart"/>
-      <w:r>
-        <w:rPr>
-          <w:rFonts w:ascii="Consolas" w:hAnsi="Consolas" w:cs="Times New Roman"/>
-          <w:sz w:val="22"/>
-        </w:rPr>
-        <w:t>question</w:t>
-      </w:r>
-      <w:proofErr w:type="spellEnd"/>
-      <w:r>
-        <w:rPr>
-          <w:rFonts w:ascii="Consolas" w:hAnsi="Consolas" w:cs="Times New Roman"/>
-          <w:sz w:val="22"/>
-        </w:rPr>
-        <w:t xml:space="preserve"> </w:t>
-      </w:r>
-      <w:proofErr w:type="spellStart"/>
-      <w:r>
-        <w:rPr>
-          <w:rFonts w:ascii="Consolas" w:hAnsi="Consolas" w:cs="Times New Roman"/>
-          <w:sz w:val="22"/>
-        </w:rPr>
-        <w:t>in</w:t>
-      </w:r>
-      <w:proofErr w:type="spellEnd"/>
-      <w:r>
-        <w:rPr>
-          <w:rFonts w:ascii="Consolas" w:hAnsi="Consolas" w:cs="Times New Roman"/>
-          <w:sz w:val="22"/>
-        </w:rPr>
-        <w:t xml:space="preserve"> </w:t>
-      </w:r>
-      <w:proofErr w:type="spellStart"/>
-      <w:r>
-        <w:rPr>
-          <w:rFonts w:ascii="Consolas" w:hAnsi="Consolas" w:cs="Times New Roman"/>
-          <w:sz w:val="22"/>
-        </w:rPr>
-        <w:t>questions</w:t>
-      </w:r>
-      <w:proofErr w:type="spellEnd"/>
-    </w:p>
-    <w:p>
-      <w:pPr>
-        <w:spacing w:after="0" w:line="240" w:lineRule="auto"/>
-        <w:rPr>
-          <w:rFonts w:ascii="Consolas" w:hAnsi="Consolas" w:cs="Times New Roman"/>
-          <w:sz w:val="22"/>
-        </w:rPr>
-      </w:pPr>
-      <w:r>
-        <w:rPr>
-          <w:rFonts w:ascii="Consolas" w:hAnsi="Consolas" w:cs="Times New Roman"/>
-          <w:sz w:val="22"/>
+          <w:lang w:val="en-US"/>
+        </w:rPr>
+      </w:pPr>
+      <w:r>
+        <w:rPr>
+          <w:rFonts w:ascii="Consolas" w:hAnsi="Consolas" w:cs="Times New Roman"/>
+          <w:sz w:val="22"/>
+          <w:lang w:val="en-US"/>
+        </w:rPr>
+        <w:t xml:space="preserve">            for question in questions</w:t>
+      </w:r>
+    </w:p>
+    <w:p>
+      <w:pPr>
+        <w:spacing w:after="0" w:line="240" w:lineRule="auto"/>
+        <w:rPr>
+          <w:rFonts w:ascii="Consolas" w:hAnsi="Consolas" w:cs="Times New Roman"/>
+          <w:sz w:val="22"/>
+          <w:lang w:val="en-US"/>
+        </w:rPr>
+      </w:pPr>
+      <w:r>
+        <w:rPr>
+          <w:rFonts w:ascii="Consolas" w:hAnsi="Consolas" w:cs="Times New Roman"/>
+          <w:sz w:val="22"/>
+          <w:lang w:val="en-US"/>
         </w:rPr>
         <w:t xml:space="preserve">        ]</w:t>
       </w:r>
@@ -17301,12 +16961,14 @@
         <w:rPr>
           <w:rFonts w:ascii="Consolas" w:hAnsi="Consolas" w:cs="Times New Roman"/>
           <w:sz w:val="22"/>
-        </w:rPr>
-      </w:pPr>
-      <w:r>
-        <w:rPr>
-          <w:rFonts w:ascii="Consolas" w:hAnsi="Consolas" w:cs="Times New Roman"/>
-          <w:sz w:val="22"/>
+          <w:lang w:val="en-US"/>
+        </w:rPr>
+      </w:pPr>
+      <w:r>
+        <w:rPr>
+          <w:rFonts w:ascii="Consolas" w:hAnsi="Consolas" w:cs="Times New Roman"/>
+          <w:sz w:val="22"/>
+          <w:lang w:val="en-US"/>
         </w:rPr>
         <w:t xml:space="preserve">    )</w:t>
       </w:r>
@@ -17316,12 +16978,14 @@
         <w:rPr>
           <w:rFonts w:ascii="Consolas" w:hAnsi="Consolas" w:cs="Times New Roman"/>
           <w:sz w:val="22"/>
-        </w:rPr>
-      </w:pPr>
-      <w:r>
-        <w:rPr>
-          <w:rFonts w:ascii="Consolas" w:hAnsi="Consolas" w:cs="Times New Roman"/>
-          <w:sz w:val="22"/>
+          <w:lang w:val="en-US"/>
+        </w:rPr>
+      </w:pPr>
+      <w:r>
+        <w:rPr>
+          <w:rFonts w:ascii="Consolas" w:hAnsi="Consolas" w:cs="Times New Roman"/>
+          <w:sz w:val="22"/>
+          <w:lang w:val="en-US"/>
         </w:rPr>
         <w:br w:type="page"/>
       </w:r>
@@ -17336,6 +17000,7 @@
           <w:b/>
           <w:color w:val="auto"/>
           <w:sz w:val="24"/>
+          <w:lang w:val="en-US"/>
         </w:rPr>
       </w:pPr>
       <w:bookmarkStart w:id="18" w:name="_Toc231056684"/>
@@ -17347,7 +17012,45 @@
           <w:sz w:val="24"/>
         </w:rPr>
         <w:lastRenderedPageBreak/>
-        <w:t>ССЫЛКА НА ПРОЕКТ</w:t>
+        <w:t>ССЫЛКА</w:t>
+      </w:r>
+      <w:r>
+        <w:rPr>
+          <w:rFonts w:ascii="Times New Roman" w:hAnsi="Times New Roman" w:cs="Times New Roman"/>
+          <w:b/>
+          <w:color w:val="auto"/>
+          <w:sz w:val="24"/>
+          <w:lang w:val="en-US"/>
+        </w:rPr>
+        <w:t xml:space="preserve"> </w:t>
+      </w:r>
+      <w:r>
+        <w:rPr>
+          <w:rFonts w:ascii="Times New Roman" w:hAnsi="Times New Roman" w:cs="Times New Roman"/>
+          <w:b/>
+          <w:color w:val="auto"/>
+          <w:sz w:val="24"/>
+        </w:rPr>
+        <w:t>НА</w:t>
+      </w:r>
+      <w:r>
+        <w:rPr>
+          <w:rFonts w:ascii="Times New Roman" w:hAnsi="Times New Roman" w:cs="Times New Roman"/>
+          <w:b/>
+          <w:color w:val="auto"/>
+          <w:sz w:val="24"/>
+          <w:lang w:val="en-US"/>
+        </w:rPr>
+        <w:t xml:space="preserve"> </w:t>
+      </w:r>
+      <w:r>
+        <w:rPr>
+          <w:rFonts w:ascii="Times New Roman" w:hAnsi="Times New Roman" w:cs="Times New Roman"/>
+          <w:b/>
+          <w:color w:val="auto"/>
+          <w:sz w:val="24"/>
+        </w:rPr>
+        <w:t>ПРОЕКТ</w:t>
       </w:r>
       <w:bookmarkEnd w:id="18"/>
     </w:p>
@@ -17357,8 +17060,17 @@
         <w:rPr>
           <w:rFonts w:ascii="Times New Roman" w:hAnsi="Times New Roman" w:cs="Times New Roman"/>
           <w:szCs w:val="28"/>
-        </w:rPr>
-      </w:pPr>
+          <w:lang w:val="en-US"/>
+        </w:rPr>
+      </w:pPr>
+      <w:r>
+        <w:rPr>
+          <w:rFonts w:ascii="Times New Roman" w:hAnsi="Times New Roman" w:cs="Times New Roman"/>
+          <w:szCs w:val="28"/>
+          <w:lang w:val="en-US"/>
+        </w:rPr>
+        <w:t>https://github.com/ZentifyID/mobile-development-lessons</w:t>
+      </w:r>
     </w:p>
     <w:sectPr>
       <w:pgSz w:w="11906" w:h="16838"/>

</xml_diff>